<commit_message>
docs: prepare repository for public release
Rewrite README as public front page, add MIT LICENSE and CONTRIBUTING,
correct SSRF coverage claim to partial across README and completion report,
add Requirements section, lead authorized-use with India's IT Act.

Co-authored-by: Aachal <AachalGodse@users.noreply.github.com>
Co-Authored-By: Claude Opus 4.8 <noreply@anthropic.com>
</commit_message>
<xml_diff>
--- a/docs/Doppel_Completion_Report.docx
+++ b/docs/Doppel_Completion_Report.docx
@@ -515,7 +515,7 @@
           <w:sz w:val="22"/>
           <w:szCs w:val="22"/>
         </w:rPr>
-        <w:t xml:space="preserve">Supporting cast (the control group for the measurement): five baseline scanners (SQL injection, XSS, JWT, security misconfiguration, rate-limiting), a BFLA engine, a Typer CLI, a self-contained HTML report with the AI trace, and an offline Streamlit dashboard.</w:t>
+        <w:t xml:space="preserve">Supporting cast (the control group for the measurement): five baseline scanners (SQL injection + XSS, JWT, SSRF, security misconfiguration, and rate-limiting), a BFLA engine, a Typer CLI, a self-contained HTML report with the AI trace, and an offline Streamlit dashboard.</w:t>
       </w:r>
     </w:p>
     <w:p>
@@ -3153,6 +3153,25 @@
     </w:p>
     <w:p>
       <w:pPr>
+        <w:pStyle w:val="ListParagraph"/>
+        <w:numPr>
+          <w:ilvl w:val="0"/>
+          <w:numId w:val="2"/>
+        </w:numPr>
+        <w:spacing w:after="60" w:line="276"/>
+      </w:pPr>
+      <w:r>
+        <w:rPr>
+          <w:rFonts w:ascii="Calibri" w:cs="Calibri" w:eastAsia="Calibri" w:hAnsi="Calibri"/>
+          <w:color w:val="1F2A44"/>
+          <w:sz w:val="22"/>
+          <w:szCs w:val="22"/>
+        </w:rPr>
+        <w:t xml:space="preserve">The SSRF scanner ships but its positive-detection path is unverified — it has never been run against a target with a real SSRF flaw (it correctly reports nothing on VAmPI, which has no SSRF surface).</w:t>
+      </w:r>
+    </w:p>
+    <w:p>
+      <w:pPr>
         <w:pBdr>
           <w:bottom w:val="single" w:color="C9CFDD" w:sz="6" w:space="1"/>
         </w:pBdr>

</xml_diff>